<commit_message>
Latest Phase 1 Docs
</commit_message>
<xml_diff>
--- a/Phase1/Week3/Day1/week03-day-1-AI Browser extension.docx
+++ b/Phase1/Week3/Day1/week03-day-1-AI Browser extension.docx
@@ -50,6 +50,7 @@
       </w:pPr>
       <w:r>
         <w:rPr>
+          <w:noProof/>
           <w:lang w:val="en-US"/>
         </w:rPr>
         <w:drawing>
@@ -144,6 +145,7 @@
         <w:rPr>
           <w:b/>
           <w:bCs/>
+          <w:noProof/>
           <w:lang w:val="en-US"/>
         </w:rPr>
         <w:drawing>
@@ -204,6 +206,7 @@
         <w:rPr>
           <w:b/>
           <w:bCs/>
+          <w:noProof/>
           <w:lang w:val="en-US"/>
         </w:rPr>
         <w:lastRenderedPageBreak/>
@@ -265,6 +268,7 @@
         <w:rPr>
           <w:b/>
           <w:bCs/>
+          <w:noProof/>
           <w:lang w:val="en-US"/>
         </w:rPr>
         <w:drawing>
@@ -3370,290 +3374,6 @@
         </w:rPr>
         <w:t>}</w:t>
       </w:r>
-    </w:p>
-    <w:p>
-      <w:pPr>
-        <w:rPr>
-          <w:b/>
-          <w:bCs/>
-          <w:lang w:val="en-US"/>
-        </w:rPr>
-      </w:pPr>
-    </w:p>
-    <w:p>
-      <w:pPr>
-        <w:rPr>
-          <w:b/>
-          <w:bCs/>
-          <w:lang w:val="en-US"/>
-        </w:rPr>
-      </w:pPr>
-    </w:p>
-    <w:p>
-      <w:pPr>
-        <w:rPr>
-          <w:b/>
-          <w:bCs/>
-          <w:lang w:val="en-US"/>
-        </w:rPr>
-      </w:pPr>
-      <w:r>
-        <w:rPr>
-          <w:b/>
-          <w:bCs/>
-          <w:lang w:val="en-US"/>
-        </w:rPr>
-        <w:t>Vibe coding to generate feature file with Playwright with TypeScript:</w:t>
-      </w:r>
-    </w:p>
-    <w:p>
-      <w:pPr>
-        <w:rPr>
-          <w:b/>
-          <w:bCs/>
-          <w:lang w:val="en-US"/>
-        </w:rPr>
-      </w:pPr>
-    </w:p>
-    <w:p>
-      <w:pPr>
-        <w:rPr>
-          <w:b/>
-          <w:bCs/>
-          <w:lang w:val="en-US"/>
-        </w:rPr>
-      </w:pPr>
-      <w:r>
-        <w:rPr>
-          <w:b/>
-          <w:bCs/>
-          <w:lang w:val="en-US"/>
-        </w:rPr>
-        <w:t xml:space="preserve">Before </w:t>
-      </w:r>
-      <w:r>
-        <w:rPr>
-          <w:b/>
-          <w:bCs/>
-          <w:lang w:val="en-US"/>
-        </w:rPr>
-        <w:t xml:space="preserve">vibe code </w:t>
-      </w:r>
-      <w:r>
-        <w:rPr>
-          <w:b/>
-          <w:bCs/>
-          <w:lang w:val="en-US"/>
-        </w:rPr>
-        <w:t>Implementation:</w:t>
-      </w:r>
-    </w:p>
-    <w:p>
-      <w:pPr>
-        <w:rPr>
-          <w:b/>
-          <w:bCs/>
-          <w:lang w:val="en-US"/>
-        </w:rPr>
-      </w:pPr>
-    </w:p>
-    <w:p>
-      <w:pPr>
-        <w:rPr>
-          <w:b/>
-          <w:bCs/>
-          <w:lang w:val="en-US"/>
-        </w:rPr>
-      </w:pPr>
-      <w:r>
-        <w:rPr>
-          <w:b/>
-          <w:bCs/>
-          <w:lang w:val="en-US"/>
-        </w:rPr>
-        <w:drawing>
-          <wp:inline distT="0" distB="0" distL="0" distR="0" wp14:anchorId="27CCC8C4" wp14:editId="2F7E75A2">
-            <wp:extent cx="5731510" cy="2436495"/>
-            <wp:effectExtent l="0" t="0" r="2540" b="1905"/>
-            <wp:docPr id="1665004358" name="Picture 1"/>
-            <wp:cNvGraphicFramePr>
-              <a:graphicFrameLocks xmlns:a="http://schemas.openxmlformats.org/drawingml/2006/main" noChangeAspect="1"/>
-            </wp:cNvGraphicFramePr>
-            <a:graphic xmlns:a="http://schemas.openxmlformats.org/drawingml/2006/main">
-              <a:graphicData uri="http://schemas.openxmlformats.org/drawingml/2006/picture">
-                <pic:pic xmlns:pic="http://schemas.openxmlformats.org/drawingml/2006/picture">
-                  <pic:nvPicPr>
-                    <pic:cNvPr id="1665004358" name=""/>
-                    <pic:cNvPicPr/>
-                  </pic:nvPicPr>
-                  <pic:blipFill>
-                    <a:blip r:embed="rId8"/>
-                    <a:stretch>
-                      <a:fillRect/>
-                    </a:stretch>
-                  </pic:blipFill>
-                  <pic:spPr>
-                    <a:xfrm>
-                      <a:off x="0" y="0"/>
-                      <a:ext cx="5731510" cy="2436495"/>
-                    </a:xfrm>
-                    <a:prstGeom prst="rect">
-                      <a:avLst/>
-                    </a:prstGeom>
-                  </pic:spPr>
-                </pic:pic>
-              </a:graphicData>
-            </a:graphic>
-          </wp:inline>
-        </w:drawing>
-      </w:r>
-    </w:p>
-    <w:p>
-      <w:pPr>
-        <w:rPr>
-          <w:b/>
-          <w:bCs/>
-          <w:lang w:val="en-US"/>
-        </w:rPr>
-      </w:pPr>
-    </w:p>
-    <w:p>
-      <w:pPr>
-        <w:rPr>
-          <w:b/>
-          <w:bCs/>
-          <w:lang w:val="en-US"/>
-        </w:rPr>
-      </w:pPr>
-      <w:r>
-        <w:rPr>
-          <w:b/>
-          <w:bCs/>
-          <w:lang w:val="en-US"/>
-        </w:rPr>
-        <w:lastRenderedPageBreak/>
-        <w:drawing>
-          <wp:inline distT="0" distB="0" distL="0" distR="0" wp14:anchorId="58C6A109" wp14:editId="25614C2B">
-            <wp:extent cx="5731510" cy="2752725"/>
-            <wp:effectExtent l="0" t="0" r="2540" b="9525"/>
-            <wp:docPr id="630204670" name="Picture 1"/>
-            <wp:cNvGraphicFramePr>
-              <a:graphicFrameLocks xmlns:a="http://schemas.openxmlformats.org/drawingml/2006/main" noChangeAspect="1"/>
-            </wp:cNvGraphicFramePr>
-            <a:graphic xmlns:a="http://schemas.openxmlformats.org/drawingml/2006/main">
-              <a:graphicData uri="http://schemas.openxmlformats.org/drawingml/2006/picture">
-                <pic:pic xmlns:pic="http://schemas.openxmlformats.org/drawingml/2006/picture">
-                  <pic:nvPicPr>
-                    <pic:cNvPr id="630204670" name=""/>
-                    <pic:cNvPicPr/>
-                  </pic:nvPicPr>
-                  <pic:blipFill>
-                    <a:blip r:embed="rId9"/>
-                    <a:stretch>
-                      <a:fillRect/>
-                    </a:stretch>
-                  </pic:blipFill>
-                  <pic:spPr>
-                    <a:xfrm>
-                      <a:off x="0" y="0"/>
-                      <a:ext cx="5731510" cy="2752725"/>
-                    </a:xfrm>
-                    <a:prstGeom prst="rect">
-                      <a:avLst/>
-                    </a:prstGeom>
-                  </pic:spPr>
-                </pic:pic>
-              </a:graphicData>
-            </a:graphic>
-          </wp:inline>
-        </w:drawing>
-      </w:r>
-    </w:p>
-    <w:p>
-      <w:pPr>
-        <w:rPr>
-          <w:b/>
-          <w:bCs/>
-          <w:lang w:val="en-US"/>
-        </w:rPr>
-      </w:pPr>
-    </w:p>
-    <w:p>
-      <w:pPr>
-        <w:rPr>
-          <w:b/>
-          <w:bCs/>
-          <w:lang w:val="en-US"/>
-        </w:rPr>
-      </w:pPr>
-      <w:r>
-        <w:rPr>
-          <w:b/>
-          <w:bCs/>
-          <w:lang w:val="en-US"/>
-        </w:rPr>
-        <w:t>After vide code implementation:</w:t>
-      </w:r>
-    </w:p>
-    <w:p>
-      <w:pPr>
-        <w:rPr>
-          <w:b/>
-          <w:bCs/>
-          <w:lang w:val="en-US"/>
-        </w:rPr>
-      </w:pPr>
-      <w:r>
-        <w:rPr>
-          <w:b/>
-          <w:bCs/>
-          <w:lang w:val="en-US"/>
-        </w:rPr>
-        <w:drawing>
-          <wp:inline distT="0" distB="0" distL="0" distR="0" wp14:anchorId="3C58C14B" wp14:editId="666AA67E">
-            <wp:extent cx="5731510" cy="3735705"/>
-            <wp:effectExtent l="0" t="0" r="2540" b="0"/>
-            <wp:docPr id="1048515879" name="Picture 1"/>
-            <wp:cNvGraphicFramePr>
-              <a:graphicFrameLocks xmlns:a="http://schemas.openxmlformats.org/drawingml/2006/main" noChangeAspect="1"/>
-            </wp:cNvGraphicFramePr>
-            <a:graphic xmlns:a="http://schemas.openxmlformats.org/drawingml/2006/main">
-              <a:graphicData uri="http://schemas.openxmlformats.org/drawingml/2006/picture">
-                <pic:pic xmlns:pic="http://schemas.openxmlformats.org/drawingml/2006/picture">
-                  <pic:nvPicPr>
-                    <pic:cNvPr id="1048515879" name=""/>
-                    <pic:cNvPicPr/>
-                  </pic:nvPicPr>
-                  <pic:blipFill>
-                    <a:blip r:embed="rId10"/>
-                    <a:stretch>
-                      <a:fillRect/>
-                    </a:stretch>
-                  </pic:blipFill>
-                  <pic:spPr>
-                    <a:xfrm>
-                      <a:off x="0" y="0"/>
-                      <a:ext cx="5731510" cy="3735705"/>
-                    </a:xfrm>
-                    <a:prstGeom prst="rect">
-                      <a:avLst/>
-                    </a:prstGeom>
-                  </pic:spPr>
-                </pic:pic>
-              </a:graphicData>
-            </a:graphic>
-          </wp:inline>
-        </w:drawing>
-      </w:r>
-    </w:p>
-    <w:p>
-      <w:pPr>
-        <w:rPr>
-          <w:b/>
-          <w:bCs/>
-          <w:lang w:val="en-US"/>
-        </w:rPr>
-      </w:pPr>
     </w:p>
     <w:p>
       <w:pPr>

</xml_diff>